<commit_message>
feat: update template images and fix resume export logic
</commit_message>
<xml_diff>
--- a/server/app/static/templates/executive.docx
+++ b/server/app/static/templates/executive.docx
@@ -28,16 +28,7 @@
           <w:sz w:val="20"/>
           <w:szCs w:val="20"/>
         </w:rPr>
-        <w:t xml:space="preserve">{{ phone }}</w:t>
-      </w:r>
-      <w:r>
-        <w:rPr>
-          <w:rFonts w:ascii="Calibri" w:hAnsi="Calibri" w:cs="Calibri"/>
-          <w:color w:val="1a1a1a"/>
-          <w:sz w:val="20"/>
-          <w:szCs w:val="20"/>
-        </w:rPr>
-        <w:t xml:space="preserve">  •  {{ email }}</w:t>
+        <w:t>{{ phone }}  •  {{ email }}</w:t>
       </w:r>
     </w:p>
     <w:p>
@@ -273,15 +264,7 @@
           <w:sz w:val="20"/>
           <w:szCs w:val="20"/>
         </w:rPr>
-        <w:t xml:space="preserve">{{ item.context }}</w:t>
-      </w:r>
-      <w:r>
-        <w:rPr>
-          <w:rFonts w:ascii="Calibri" w:hAnsi="Calibri" w:cs="Calibri"/>
-          <w:sz w:val="20"/>
-          <w:szCs w:val="20"/>
-        </w:rPr>
-        <w:t xml:space="preserve">{% endif %}</w:t>
+        <w:t>{{ item.context }}{% endif %}</w:t>
       </w:r>
     </w:p>
     <w:p>
@@ -311,15 +294,6 @@
           <w:szCs w:val="20"/>
         </w:rPr>
         <w:t xml:space="preserve">•  </w:t>
-      </w:r>
-      <w:r>
-        <w:rPr>
-          <w:rFonts w:ascii="Calibri" w:hAnsi="Calibri" w:cs="Calibri"/>
-          <w:color w:val="1a1a1a"/>
-          <w:sz w:val="20"/>
-          <w:szCs w:val="20"/>
-        </w:rPr>
-        <w:t xml:space="preserve"/>
       </w:r>
       <w:r>
         <w:rPr>
@@ -580,7 +554,7 @@
     </w:rPrDefault>
     <w:pPrDefault>
       <w:pPr>
-        <w:spacing w:after="200" w:line="276" w:lineRule="auto"/>
+        <w:spacing w:after="0" w:line="240" w:lineRule="auto"/>
       </w:pPr>
     </w:pPrDefault>
   </w:docDefaults>

</xml_diff>

<commit_message>
feat: add education section to resume templates and update related models
</commit_message>
<xml_diff>
--- a/server/app/static/templates/executive.docx
+++ b/server/app/static/templates/executive.docx
@@ -328,6 +328,460 @@
           <w:szCs w:val="20"/>
         </w:rPr>
         <w:t xml:space="preserve">{% endfor %}</w:t>
+      </w:r>
+    </w:p>
+    <w:p>
+      <w:pPr>
+        <w:spacing w:before="0" w:after="0" w:line="240" w:lineRule="auto"/>
+      </w:pPr>
+      <w:r>
+        <w:rPr>
+          <w:rFonts w:ascii="Calibri" w:hAnsi="Calibri" w:cs="Calibri"/>
+          <w:sz w:val="20"/>
+          <w:szCs w:val="20"/>
+        </w:rPr>
+        <w:t xml:space="preserve">{% if education %}</w:t>
+      </w:r>
+    </w:p>
+    <w:p>
+      <w:pPr>
+        <w:spacing w:before="160" w:after="40" w:line="240" w:lineRule="auto"/>
+        <w:pBdr>
+          <w:bottom w:val="single" w:sz="4" w:space="3" w:color="000000"/>
+        </w:pBdr>
+      </w:pPr>
+      <w:r>
+        <w:rPr>
+          <w:rFonts w:ascii="Calibri" w:hAnsi="Calibri" w:cs="Calibri"/>
+          <w:b/>
+          <w:bCs/>
+          <w:color w:val="000000"/>
+          <w:sz w:val="22"/>
+          <w:szCs w:val="22"/>
+        </w:rPr>
+        <w:t>EDUCATION</w:t>
+      </w:r>
+    </w:p>
+    <w:p>
+      <w:pPr>
+        <w:spacing w:before="0" w:after="0" w:line="240" w:lineRule="auto"/>
+      </w:pPr>
+      <w:r>
+        <w:rPr>
+          <w:rFonts w:ascii="Calibri" w:hAnsi="Calibri" w:cs="Calibri"/>
+          <w:sz w:val="20"/>
+          <w:szCs w:val="20"/>
+        </w:rPr>
+        <w:t xml:space="preserve">{% for item in education %}</w:t>
+      </w:r>
+    </w:p>
+    <w:p>
+      <w:pPr>
+        <w:spacing w:before="120" w:after="0" w:line="240" w:lineRule="auto"/>
+        <w:tabs>
+          <w:tab w:val="right" w:pos="9360"/>
+        </w:tabs>
+      </w:pPr>
+      <w:r>
+        <w:rPr>
+          <w:rFonts w:ascii="Calibri" w:hAnsi="Calibri" w:cs="Calibri"/>
+          <w:sz w:val="20"/>
+          <w:szCs w:val="20"/>
+        </w:rPr>
+        <w:t xml:space="preserve">{{ item.institution }}</w:t>
+      </w:r>
+      <w:r>
+        <w:rPr>
+          <w:rFonts w:ascii="Calibri" w:hAnsi="Calibri" w:cs="Calibri"/>
+          <w:color w:val="1a1a1a"/>
+          <w:sz w:val="19"/>
+          <w:szCs w:val="19"/>
+        </w:rPr>
+        <w:t xml:space="preserve">,  </w:t>
+      </w:r>
+      <w:r>
+        <w:rPr>
+          <w:rFonts w:ascii="Calibri" w:hAnsi="Calibri" w:cs="Calibri"/>
+          <w:sz w:val="20"/>
+          <w:szCs w:val="20"/>
+        </w:rPr>
+        <w:t xml:space="preserve">{{ item.location }}</w:t>
+      </w:r>
+      <w:r>
+        <w:rPr>
+          <w:rFonts w:ascii="Calibri" w:hAnsi="Calibri" w:cs="Calibri"/>
+        </w:rPr>
+        <w:tab/>
+      </w:r>
+      <w:r>
+        <w:rPr>
+          <w:rFonts w:ascii="Calibri" w:hAnsi="Calibri" w:cs="Calibri"/>
+          <w:color w:val="666666"/>
+          <w:sz w:val="19"/>
+          <w:szCs w:val="19"/>
+        </w:rPr>
+        <w:t xml:space="preserve">{{ item.start_date }}{% if item.start_date and item.end_date %} – {% endif %}{{ item.end_date }}</w:t>
+      </w:r>
+    </w:p>
+    <w:p>
+      <w:pPr>
+        <w:spacing w:before="0" w:after="4" w:line="240" w:lineRule="auto"/>
+      </w:pPr>
+      <w:r>
+        <w:rPr>
+          <w:rFonts w:ascii="Calibri" w:hAnsi="Calibri" w:cs="Calibri"/>
+          <w:i/>
+          <w:iCs/>
+          <w:color w:val="444444"/>
+          <w:sz w:val="20"/>
+          <w:szCs w:val="20"/>
+        </w:rPr>
+        <w:t xml:space="preserve">{{ item.degree }}</w:t>
+      </w:r>
+    </w:p>
+    <w:p>
+      <w:pPr>
+        <w:spacing w:before="0" w:after="30" w:line="240" w:lineRule="auto"/>
+      </w:pPr>
+      <w:r>
+        <w:rPr>
+          <w:rFonts w:ascii="Calibri" w:hAnsi="Calibri" w:cs="Calibri"/>
+          <w:sz w:val="20"/>
+          <w:szCs w:val="20"/>
+        </w:rPr>
+        <w:t xml:space="preserve">{% if item.gpa %}GPA: {{ item.gpa }}{% endif %}{% if item.honors %}  ·  {{ item.honors }}{% endif %}</w:t>
+      </w:r>
+    </w:p>
+    <w:p>
+      <w:pPr>
+        <w:spacing w:before="0" w:after="60" w:line="240" w:lineRule="auto"/>
+      </w:pPr>
+      <w:r>
+        <w:rPr>
+          <w:rFonts w:ascii="Calibri" w:hAnsi="Calibri" w:cs="Calibri"/>
+          <w:sz w:val="20"/>
+          <w:szCs w:val="20"/>
+        </w:rPr>
+        <w:t xml:space="preserve">{% endfor %}</w:t>
+      </w:r>
+    </w:p>
+    <w:p>
+      <w:pPr>
+        <w:spacing w:before="0" w:after="0" w:line="240" w:lineRule="auto"/>
+      </w:pPr>
+      <w:r>
+        <w:rPr>
+          <w:rFonts w:ascii="Calibri" w:hAnsi="Calibri" w:cs="Calibri"/>
+          <w:sz w:val="20"/>
+          <w:szCs w:val="20"/>
+        </w:rPr>
+        <w:t xml:space="preserve">{% endif %}</w:t>
+      </w:r>
+    </w:p>
+    <w:p>
+      <w:pPr>
+        <w:spacing w:before="0" w:after="0" w:line="240" w:lineRule="auto"/>
+      </w:pPr>
+      <w:r>
+        <w:rPr>
+          <w:rFonts w:ascii="Calibri" w:hAnsi="Calibri" w:cs="Calibri"/>
+          <w:sz w:val="20"/>
+          <w:szCs w:val="20"/>
+        </w:rPr>
+        <w:t xml:space="preserve">{% if projects %}</w:t>
+      </w:r>
+    </w:p>
+    <w:p>
+      <w:pPr>
+        <w:spacing w:before="160" w:after="40" w:line="240" w:lineRule="auto"/>
+        <w:pBdr>
+          <w:bottom w:val="single" w:sz="4" w:space="3" w:color="000000"/>
+        </w:pBdr>
+      </w:pPr>
+      <w:r>
+        <w:rPr>
+          <w:rFonts w:ascii="Calibri" w:hAnsi="Calibri" w:cs="Calibri"/>
+          <w:b/>
+          <w:bCs/>
+          <w:color w:val="000000"/>
+          <w:sz w:val="22"/>
+          <w:szCs w:val="22"/>
+        </w:rPr>
+        <w:t>PROJECTS</w:t>
+      </w:r>
+    </w:p>
+    <w:p>
+      <w:pPr>
+        <w:spacing w:before="0" w:after="0" w:line="240" w:lineRule="auto"/>
+      </w:pPr>
+      <w:r>
+        <w:rPr>
+          <w:rFonts w:ascii="Calibri" w:hAnsi="Calibri" w:cs="Calibri"/>
+          <w:sz w:val="20"/>
+          <w:szCs w:val="20"/>
+        </w:rPr>
+        <w:t xml:space="preserve">{% for item in projects %}</w:t>
+      </w:r>
+    </w:p>
+    <w:p>
+      <w:pPr>
+        <w:spacing w:before="120" w:after="0" w:line="240" w:lineRule="auto"/>
+        <w:tabs>
+          <w:tab w:val="right" w:pos="9360"/>
+        </w:tabs>
+      </w:pPr>
+      <w:r>
+        <w:rPr>
+          <w:rFonts w:ascii="Calibri" w:hAnsi="Calibri" w:cs="Calibri"/>
+          <w:b/>
+          <w:bCs/>
+          <w:sz w:val="20"/>
+          <w:szCs w:val="20"/>
+        </w:rPr>
+        <w:t xml:space="preserve">{{ item.name }}</w:t>
+      </w:r>
+      <w:r>
+        <w:rPr>
+          <w:rFonts w:ascii="Calibri" w:hAnsi="Calibri" w:cs="Calibri"/>
+        </w:rPr>
+        <w:tab/>
+      </w:r>
+      <w:r>
+        <w:rPr>
+          <w:rFonts w:ascii="Calibri" w:hAnsi="Calibri" w:cs="Calibri"/>
+          <w:color w:val="666666"/>
+          <w:sz w:val="19"/>
+          <w:szCs w:val="19"/>
+        </w:rPr>
+        <w:t xml:space="preserve">{% if item.date %}{{ item.date }}{% endif %}</w:t>
+      </w:r>
+    </w:p>
+    <w:p>
+      <w:pPr>
+        <w:spacing w:before="0" w:after="30" w:line="240" w:lineRule="auto"/>
+      </w:pPr>
+      <w:r>
+        <w:rPr>
+          <w:rFonts w:ascii="Calibri" w:hAnsi="Calibri" w:cs="Calibri"/>
+          <w:sz w:val="20"/>
+          <w:szCs w:val="20"/>
+        </w:rPr>
+        <w:t xml:space="preserve">{% if item.tech %}</w:t>
+      </w:r>
+      <w:r>
+        <w:rPr>
+          <w:rFonts w:ascii="Calibri" w:hAnsi="Calibri" w:cs="Calibri"/>
+          <w:i/>
+          <w:iCs/>
+          <w:color w:val="888888"/>
+          <w:sz w:val="19"/>
+          <w:szCs w:val="19"/>
+        </w:rPr>
+        <w:t xml:space="preserve">{{ item.tech }}</w:t>
+      </w:r>
+      <w:r>
+        <w:rPr>
+          <w:rFonts w:ascii="Calibri" w:hAnsi="Calibri" w:cs="Calibri"/>
+          <w:sz w:val="20"/>
+          <w:szCs w:val="20"/>
+        </w:rPr>
+        <w:t xml:space="preserve">{% endif %}</w:t>
+      </w:r>
+    </w:p>
+    <w:p>
+      <w:pPr>
+        <w:spacing w:before="0" w:after="0" w:line="240" w:lineRule="auto"/>
+      </w:pPr>
+      <w:r>
+        <w:rPr>
+          <w:rFonts w:ascii="Calibri" w:hAnsi="Calibri" w:cs="Calibri"/>
+          <w:sz w:val="20"/>
+          <w:szCs w:val="20"/>
+        </w:rPr>
+        <w:t xml:space="preserve">{% for bullet in item.bullets %}</w:t>
+      </w:r>
+    </w:p>
+    <w:p>
+      <w:pPr>
+        <w:spacing w:before="30" w:after="30" w:line="240" w:lineRule="auto"/>
+        <w:contextualSpacing/>
+        <w:ind w:left="360" w:hanging="240"/>
+      </w:pPr>
+      <w:r>
+        <w:rPr>
+          <w:rFonts w:ascii="Calibri" w:hAnsi="Calibri" w:cs="Calibri"/>
+          <w:color w:val="1a1a1a"/>
+          <w:sz w:val="20"/>
+          <w:szCs w:val="20"/>
+        </w:rPr>
+        <w:t xml:space="preserve">•  </w:t>
+      </w:r>
+      <w:r>
+        <w:rPr>
+          <w:rFonts w:ascii="Calibri" w:hAnsi="Calibri" w:cs="Calibri"/>
+          <w:sz w:val="20"/>
+          <w:szCs w:val="20"/>
+        </w:rPr>
+        <w:t xml:space="preserve">{{ bullet }}</w:t>
+      </w:r>
+    </w:p>
+    <w:p>
+      <w:pPr>
+        <w:spacing w:before="0" w:after="0" w:line="240" w:lineRule="auto"/>
+      </w:pPr>
+      <w:r>
+        <w:rPr>
+          <w:rFonts w:ascii="Calibri" w:hAnsi="Calibri" w:cs="Calibri"/>
+          <w:sz w:val="20"/>
+          <w:szCs w:val="20"/>
+        </w:rPr>
+        <w:t xml:space="preserve">{% endfor %}</w:t>
+      </w:r>
+    </w:p>
+    <w:p>
+      <w:pPr>
+        <w:spacing w:before="0" w:after="60" w:line="240" w:lineRule="auto"/>
+      </w:pPr>
+      <w:r>
+        <w:rPr>
+          <w:rFonts w:ascii="Calibri" w:hAnsi="Calibri" w:cs="Calibri"/>
+          <w:sz w:val="20"/>
+          <w:szCs w:val="20"/>
+        </w:rPr>
+        <w:t xml:space="preserve">{% endfor %}</w:t>
+      </w:r>
+    </w:p>
+    <w:p>
+      <w:pPr>
+        <w:spacing w:before="0" w:after="0" w:line="240" w:lineRule="auto"/>
+      </w:pPr>
+      <w:r>
+        <w:rPr>
+          <w:rFonts w:ascii="Calibri" w:hAnsi="Calibri" w:cs="Calibri"/>
+          <w:sz w:val="20"/>
+          <w:szCs w:val="20"/>
+        </w:rPr>
+        <w:t xml:space="preserve">{% endif %}</w:t>
+      </w:r>
+    </w:p>
+    <w:p>
+      <w:pPr>
+        <w:spacing w:before="0" w:after="0" w:line="240" w:lineRule="auto"/>
+      </w:pPr>
+      <w:r>
+        <w:rPr>
+          <w:rFonts w:ascii="Calibri" w:hAnsi="Calibri" w:cs="Calibri"/>
+          <w:sz w:val="20"/>
+          <w:szCs w:val="20"/>
+        </w:rPr>
+        <w:t xml:space="preserve">{% if certifications %}</w:t>
+      </w:r>
+    </w:p>
+    <w:p>
+      <w:pPr>
+        <w:spacing w:before="160" w:after="40" w:line="240" w:lineRule="auto"/>
+        <w:pBdr>
+          <w:bottom w:val="single" w:sz="4" w:space="3" w:color="000000"/>
+        </w:pBdr>
+      </w:pPr>
+      <w:r>
+        <w:rPr>
+          <w:rFonts w:ascii="Calibri" w:hAnsi="Calibri" w:cs="Calibri"/>
+          <w:b/>
+          <w:bCs/>
+          <w:color w:val="000000"/>
+          <w:sz w:val="22"/>
+          <w:szCs w:val="22"/>
+        </w:rPr>
+        <w:t>CERTIFICATIONS</w:t>
+      </w:r>
+    </w:p>
+    <w:p>
+      <w:pPr>
+        <w:spacing w:before="0" w:after="0" w:line="240" w:lineRule="auto"/>
+      </w:pPr>
+      <w:r>
+        <w:rPr>
+          <w:rFonts w:ascii="Calibri" w:hAnsi="Calibri" w:cs="Calibri"/>
+          <w:sz w:val="20"/>
+          <w:szCs w:val="20"/>
+        </w:rPr>
+        <w:t xml:space="preserve">{% for item in certifications %}</w:t>
+      </w:r>
+    </w:p>
+    <w:p>
+      <w:pPr>
+        <w:spacing w:before="60" w:after="0" w:line="240" w:lineRule="auto"/>
+        <w:tabs>
+          <w:tab w:val="right" w:pos="9360"/>
+        </w:tabs>
+      </w:pPr>
+      <w:r>
+        <w:rPr>
+          <w:rFonts w:ascii="Calibri" w:hAnsi="Calibri" w:cs="Calibri"/>
+          <w:b/>
+          <w:bCs/>
+          <w:sz w:val="20"/>
+          <w:szCs w:val="20"/>
+        </w:rPr>
+        <w:t xml:space="preserve">{{ item.name }}</w:t>
+      </w:r>
+      <w:r>
+        <w:rPr>
+          <w:rFonts w:ascii="Calibri" w:hAnsi="Calibri" w:cs="Calibri"/>
+        </w:rPr>
+        <w:tab/>
+      </w:r>
+      <w:r>
+        <w:rPr>
+          <w:rFonts w:ascii="Calibri" w:hAnsi="Calibri" w:cs="Calibri"/>
+          <w:color w:val="666666"/>
+          <w:sz w:val="19"/>
+          <w:szCs w:val="19"/>
+        </w:rPr>
+        <w:t xml:space="preserve">{% if item.date %}{{ item.date }}{% endif %}</w:t>
+      </w:r>
+    </w:p>
+    <w:p>
+      <w:pPr>
+        <w:spacing w:before="0" w:after="40" w:line="240" w:lineRule="auto"/>
+      </w:pPr>
+      <w:r>
+        <w:rPr>
+          <w:rFonts w:ascii="Calibri" w:hAnsi="Calibri" w:cs="Calibri"/>
+          <w:i/>
+          <w:iCs/>
+          <w:color w:val="666666"/>
+          <w:sz w:val="19"/>
+          <w:szCs w:val="19"/>
+        </w:rPr>
+        <w:t xml:space="preserve">{% if item.issuer %}{{ item.issuer }}{% endif %}</w:t>
+      </w:r>
+    </w:p>
+    <w:p>
+      <w:pPr>
+        <w:spacing w:before="0" w:after="0" w:line="240" w:lineRule="auto"/>
+      </w:pPr>
+      <w:r>
+        <w:rPr>
+          <w:rFonts w:ascii="Calibri" w:hAnsi="Calibri" w:cs="Calibri"/>
+          <w:sz w:val="20"/>
+          <w:szCs w:val="20"/>
+        </w:rPr>
+        <w:t xml:space="preserve">{% endfor %}</w:t>
+      </w:r>
+    </w:p>
+    <w:p>
+      <w:pPr>
+        <w:spacing w:before="0" w:after="0" w:line="240" w:lineRule="auto"/>
+      </w:pPr>
+      <w:r>
+        <w:rPr>
+          <w:rFonts w:ascii="Calibri" w:hAnsi="Calibri" w:cs="Calibri"/>
+          <w:sz w:val="20"/>
+          <w:szCs w:val="20"/>
+        </w:rPr>
+        <w:t xml:space="preserve">{% endif %}</w:t>
       </w:r>
     </w:p>
     <w:sectPr>

</xml_diff>

<commit_message>
feat: enhance resume structure with projects and certifications, update skill handling
</commit_message>
<xml_diff>
--- a/server/app/static/templates/executive.docx
+++ b/server/app/static/templates/executive.docx
@@ -101,7 +101,7 @@
     </w:p>
     <w:p>
       <w:pPr>
-        <w:spacing w:before="40" w:after="40" w:line="240" w:lineRule="auto"/>
+        <w:spacing w:before="0" w:after="0" w:line="240" w:lineRule="auto"/>
       </w:pPr>
       <w:r>
         <w:rPr>
@@ -109,7 +109,44 @@
           <w:sz w:val="20"/>
           <w:szCs w:val="20"/>
         </w:rPr>
-        <w:t xml:space="preserve">{{ skills | join(', ') }}</w:t>
+        <w:t xml:space="preserve">{% for cat in skills %}</w:t>
+      </w:r>
+    </w:p>
+    <w:p>
+      <w:pPr>
+        <w:spacing w:before="40" w:after="30" w:line="240" w:lineRule="auto"/>
+      </w:pPr>
+      <w:r>
+        <w:rPr>
+          <w:rFonts w:ascii="Calibri" w:hAnsi="Calibri" w:cs="Calibri"/>
+          <w:b/>
+          <w:bCs/>
+          <w:color w:val="000000"/>
+          <w:sz w:val="20"/>
+          <w:szCs w:val="20"/>
+        </w:rPr>
+        <w:t xml:space="preserve">{{ cat.category }}: </w:t>
+      </w:r>
+      <w:r>
+        <w:rPr>
+          <w:rFonts w:ascii="Calibri" w:hAnsi="Calibri" w:cs="Calibri"/>
+          <w:sz w:val="20"/>
+          <w:szCs w:val="20"/>
+        </w:rPr>
+        <w:t xml:space="preserve">{{ cat.items | join(', ') }}</w:t>
+      </w:r>
+    </w:p>
+    <w:p>
+      <w:pPr>
+        <w:spacing w:before="0" w:after="0" w:line="240" w:lineRule="auto"/>
+      </w:pPr>
+      <w:r>
+        <w:rPr>
+          <w:rFonts w:ascii="Calibri" w:hAnsi="Calibri" w:cs="Calibri"/>
+          <w:sz w:val="20"/>
+          <w:szCs w:val="20"/>
+        </w:rPr>
+        <w:t xml:space="preserve">{% endfor %}</w:t>
       </w:r>
     </w:p>
     <w:p>

</xml_diff>

<commit_message>
feat: enhance authentication modal and callback handling, improve error notifications and template updates
</commit_message>
<xml_diff>
--- a/server/app/static/templates/executive.docx
+++ b/server/app/static/templates/executive.docx
@@ -133,7 +133,7 @@
           <w:sz w:val="20"/>
           <w:szCs w:val="20"/>
         </w:rPr>
-        <w:t xml:space="preserve">{{ cat.items | join(', ') }}</w:t>
+        <w:t xml:space="preserve">{{ cat.skills | join(', ') }}</w:t>
       </w:r>
     </w:p>
     <w:p>
@@ -222,7 +222,7 @@
           <w:sz w:val="20"/>
           <w:szCs w:val="20"/>
         </w:rPr>
-        <w:t xml:space="preserve">{{ item.location }}</w:t>
+        <w:t xml:space="preserve">{{ item.location | default('') }}</w:t>
       </w:r>
       <w:r>
         <w:rPr>
@@ -282,7 +282,7 @@
           <w:sz w:val="20"/>
           <w:szCs w:val="20"/>
         </w:rPr>
-        <w:t xml:space="preserve">{% if item.context %}</w:t>
+        <w:t xml:space="preserve">{% if item.context | default('') %}</w:t>
       </w:r>
       <w:r>
         <w:rPr>
@@ -301,7 +301,7 @@
           <w:sz w:val="20"/>
           <w:szCs w:val="20"/>
         </w:rPr>
-        <w:t>{{ item.context }}{% endif %}</w:t>
+        <w:t>{{ item.context | default('') }}{% endif %}</w:t>
       </w:r>
     </w:p>
     <w:p>
@@ -442,7 +442,7 @@
           <w:sz w:val="20"/>
           <w:szCs w:val="20"/>
         </w:rPr>
-        <w:t xml:space="preserve">{{ item.location }}</w:t>
+        <w:t xml:space="preserve">{{ item.location | default('') }}</w:t>
       </w:r>
       <w:r>
         <w:rPr>
@@ -486,7 +486,7 @@
           <w:sz w:val="20"/>
           <w:szCs w:val="20"/>
         </w:rPr>
-        <w:t xml:space="preserve">{% if item.gpa %}GPA: {{ item.gpa }}{% endif %}{% if item.honors %}  ·  {{ item.honors }}{% endif %}</w:t>
+        <w:t xml:space="preserve">{% if item.gpa | default('') %}GPA: {{ item.gpa | default('') }}{% endif %}{% if item.honors | default('') %}  ·  {{ item.honors | default('') }}{% endif %}</w:t>
       </w:r>
     </w:p>
     <w:p>
@@ -590,7 +590,7 @@
           <w:sz w:val="19"/>
           <w:szCs w:val="19"/>
         </w:rPr>
-        <w:t xml:space="preserve">{% if item.date %}{{ item.date }}{% endif %}</w:t>
+        <w:t xml:space="preserve">{% if item.date_obtained | default('') %}{{ item.date_obtained | default('') }}{% endif %}</w:t>
       </w:r>
     </w:p>
     <w:p>
@@ -603,7 +603,7 @@
           <w:sz w:val="20"/>
           <w:szCs w:val="20"/>
         </w:rPr>
-        <w:t xml:space="preserve">{% if item.tech %}</w:t>
+        <w:t xml:space="preserve">{% if item.technologies | default('') %}</w:t>
       </w:r>
       <w:r>
         <w:rPr>
@@ -614,7 +614,7 @@
           <w:sz w:val="19"/>
           <w:szCs w:val="19"/>
         </w:rPr>
-        <w:t xml:space="preserve">{{ item.tech }}</w:t>
+        <w:t xml:space="preserve">{{ item.technologies | default('') }}</w:t>
       </w:r>
       <w:r>
         <w:rPr>
@@ -776,7 +776,7 @@
           <w:sz w:val="19"/>
           <w:szCs w:val="19"/>
         </w:rPr>
-        <w:t xml:space="preserve">{% if item.date %}{{ item.date }}{% endif %}</w:t>
+        <w:t xml:space="preserve">{% if item.date_obtained | default('') %}{{ item.date_obtained | default('') }}{% endif %}</w:t>
       </w:r>
     </w:p>
     <w:p>

</xml_diff>

<commit_message>
Updated document templates to use new syntax for rendering skills and other sections, improving maintainability and readability.
</commit_message>
<xml_diff>
--- a/server/app/static/templates/executive.docx
+++ b/server/app/static/templates/executive.docx
@@ -109,7 +109,7 @@
           <w:sz w:val="20"/>
           <w:szCs w:val="20"/>
         </w:rPr>
-        <w:t xml:space="preserve">{% for cat in skills %}</w:t>
+        <w:t xml:space="preserve">{%p for cat in skills %}</w:t>
       </w:r>
     </w:p>
     <w:p>
@@ -146,7 +146,7 @@
           <w:sz w:val="20"/>
           <w:szCs w:val="20"/>
         </w:rPr>
-        <w:t xml:space="preserve">{% endfor %}</w:t>
+        <w:t xml:space="preserve">{%p endfor %}</w:t>
       </w:r>
     </w:p>
     <w:p>
@@ -178,7 +178,7 @@
           <w:sz w:val="20"/>
           <w:szCs w:val="20"/>
         </w:rPr>
-        <w:t xml:space="preserve">{% for item in experience %}</w:t>
+        <w:t xml:space="preserve">{%p for item in experience %}</w:t>
       </w:r>
     </w:p>
     <w:p>
@@ -282,7 +282,7 @@
           <w:sz w:val="20"/>
           <w:szCs w:val="20"/>
         </w:rPr>
-        <w:t xml:space="preserve">{% if item.context | default('') %}</w:t>
+        <w:t xml:space="preserve">{%p if item.context | default('') %}</w:t>
       </w:r>
       <w:r>
         <w:rPr>
@@ -314,7 +314,7 @@
           <w:sz w:val="20"/>
           <w:szCs w:val="20"/>
         </w:rPr>
-        <w:t xml:space="preserve">{% for bullet in item.bullets %}</w:t>
+        <w:t xml:space="preserve">{%p for bullet in item.bullets %}</w:t>
       </w:r>
     </w:p>
     <w:p>
@@ -351,7 +351,7 @@
           <w:sz w:val="20"/>
           <w:szCs w:val="20"/>
         </w:rPr>
-        <w:t xml:space="preserve">{% endfor %}</w:t>
+        <w:t xml:space="preserve">{%p endfor %}</w:t>
       </w:r>
     </w:p>
     <w:p>
@@ -364,7 +364,7 @@
           <w:sz w:val="20"/>
           <w:szCs w:val="20"/>
         </w:rPr>
-        <w:t xml:space="preserve">{% endfor %}</w:t>
+        <w:t xml:space="preserve">{%p endfor %}</w:t>
       </w:r>
     </w:p>
     <w:p>
@@ -377,7 +377,7 @@
           <w:sz w:val="20"/>
           <w:szCs w:val="20"/>
         </w:rPr>
-        <w:t xml:space="preserve">{% if education %}</w:t>
+        <w:t xml:space="preserve">{%p if education %}</w:t>
       </w:r>
     </w:p>
     <w:p>
@@ -409,7 +409,7 @@
           <w:sz w:val="20"/>
           <w:szCs w:val="20"/>
         </w:rPr>
-        <w:t xml:space="preserve">{% for item in education %}</w:t>
+        <w:t xml:space="preserve">{%p for item in education %}</w:t>
       </w:r>
     </w:p>
     <w:p>
@@ -499,7 +499,7 @@
           <w:sz w:val="20"/>
           <w:szCs w:val="20"/>
         </w:rPr>
-        <w:t xml:space="preserve">{% endfor %}</w:t>
+        <w:t xml:space="preserve">{%p endfor %}</w:t>
       </w:r>
     </w:p>
     <w:p>
@@ -512,7 +512,7 @@
           <w:sz w:val="20"/>
           <w:szCs w:val="20"/>
         </w:rPr>
-        <w:t xml:space="preserve">{% endif %}</w:t>
+        <w:t xml:space="preserve">{%p endif %}</w:t>
       </w:r>
     </w:p>
     <w:p>
@@ -525,7 +525,7 @@
           <w:sz w:val="20"/>
           <w:szCs w:val="20"/>
         </w:rPr>
-        <w:t xml:space="preserve">{% if projects %}</w:t>
+        <w:t xml:space="preserve">{%p if projects %}</w:t>
       </w:r>
     </w:p>
     <w:p>
@@ -557,7 +557,7 @@
           <w:sz w:val="20"/>
           <w:szCs w:val="20"/>
         </w:rPr>
-        <w:t xml:space="preserve">{% for item in projects %}</w:t>
+        <w:t xml:space="preserve">{%p for item in projects %}</w:t>
       </w:r>
     </w:p>
     <w:p>
@@ -603,7 +603,7 @@
           <w:sz w:val="20"/>
           <w:szCs w:val="20"/>
         </w:rPr>
-        <w:t xml:space="preserve">{% if item.technologies | default('') %}</w:t>
+        <w:t xml:space="preserve">{%p if item.technologies | default('') %}</w:t>
       </w:r>
       <w:r>
         <w:rPr>
@@ -622,7 +622,7 @@
           <w:sz w:val="20"/>
           <w:szCs w:val="20"/>
         </w:rPr>
-        <w:t xml:space="preserve">{% endif %}</w:t>
+        <w:t xml:space="preserve">{%p endif %}</w:t>
       </w:r>
     </w:p>
     <w:p>
@@ -635,7 +635,7 @@
           <w:sz w:val="20"/>
           <w:szCs w:val="20"/>
         </w:rPr>
-        <w:t xml:space="preserve">{% for bullet in item.bullets %}</w:t>
+        <w:t xml:space="preserve">{%p for bullet in item.bullets %}</w:t>
       </w:r>
     </w:p>
     <w:p>
@@ -672,7 +672,7 @@
           <w:sz w:val="20"/>
           <w:szCs w:val="20"/>
         </w:rPr>
-        <w:t xml:space="preserve">{% endfor %}</w:t>
+        <w:t xml:space="preserve">{%p endfor %}</w:t>
       </w:r>
     </w:p>
     <w:p>
@@ -685,7 +685,7 @@
           <w:sz w:val="20"/>
           <w:szCs w:val="20"/>
         </w:rPr>
-        <w:t xml:space="preserve">{% endfor %}</w:t>
+        <w:t xml:space="preserve">{%p endfor %}</w:t>
       </w:r>
     </w:p>
     <w:p>
@@ -698,7 +698,7 @@
           <w:sz w:val="20"/>
           <w:szCs w:val="20"/>
         </w:rPr>
-        <w:t xml:space="preserve">{% endif %}</w:t>
+        <w:t xml:space="preserve">{%p endif %}</w:t>
       </w:r>
     </w:p>
     <w:p>
@@ -711,7 +711,7 @@
           <w:sz w:val="20"/>
           <w:szCs w:val="20"/>
         </w:rPr>
-        <w:t xml:space="preserve">{% if certifications %}</w:t>
+        <w:t xml:space="preserve">{%p if certifications %}</w:t>
       </w:r>
     </w:p>
     <w:p>
@@ -743,7 +743,7 @@
           <w:sz w:val="20"/>
           <w:szCs w:val="20"/>
         </w:rPr>
-        <w:t xml:space="preserve">{% for item in certifications %}</w:t>
+        <w:t xml:space="preserve">{%p for item in certifications %}</w:t>
       </w:r>
     </w:p>
     <w:p>
@@ -805,7 +805,7 @@
           <w:sz w:val="20"/>
           <w:szCs w:val="20"/>
         </w:rPr>
-        <w:t xml:space="preserve">{% endfor %}</w:t>
+        <w:t xml:space="preserve">{%p endfor %}</w:t>
       </w:r>
     </w:p>
     <w:p>
@@ -818,7 +818,7 @@
           <w:sz w:val="20"/>
           <w:szCs w:val="20"/>
         </w:rPr>
-        <w:t xml:space="preserve">{% endif %}</w:t>
+        <w:t xml:space="preserve">{%p endif %}</w:t>
       </w:r>
     </w:p>
     <w:sectPr>

</xml_diff>

<commit_message>
Enhanced template rendering with clearer exception handling.
</commit_message>
<xml_diff>
--- a/server/app/static/templates/executive.docx
+++ b/server/app/static/templates/executive.docx
@@ -109,7 +109,7 @@
           <w:sz w:val="20"/>
           <w:szCs w:val="20"/>
         </w:rPr>
-        <w:t xml:space="preserve">{%p for cat in skills %}</w:t>
+        <w:t xml:space="preserve">{% for cat in skills %}</w:t>
       </w:r>
     </w:p>
     <w:p>
@@ -146,7 +146,7 @@
           <w:sz w:val="20"/>
           <w:szCs w:val="20"/>
         </w:rPr>
-        <w:t xml:space="preserve">{%p endfor %}</w:t>
+        <w:t xml:space="preserve">{% endfor %}</w:t>
       </w:r>
     </w:p>
     <w:p>
@@ -178,7 +178,7 @@
           <w:sz w:val="20"/>
           <w:szCs w:val="20"/>
         </w:rPr>
-        <w:t xml:space="preserve">{%p for item in experience %}</w:t>
+        <w:t xml:space="preserve">{% for item in experience %}</w:t>
       </w:r>
     </w:p>
     <w:p>
@@ -282,7 +282,7 @@
           <w:sz w:val="20"/>
           <w:szCs w:val="20"/>
         </w:rPr>
-        <w:t xml:space="preserve">{%p if item.context | default('') %}</w:t>
+        <w:t xml:space="preserve">{% if item.context %}</w:t>
       </w:r>
       <w:r>
         <w:rPr>
@@ -301,7 +301,7 @@
           <w:sz w:val="20"/>
           <w:szCs w:val="20"/>
         </w:rPr>
-        <w:t>{{ item.context | default('') }}{% endif %}</w:t>
+        <w:t xml:space="preserve">{{ item.context | default('') }}{% endif %}</w:t>
       </w:r>
     </w:p>
     <w:p>
@@ -314,7 +314,7 @@
           <w:sz w:val="20"/>
           <w:szCs w:val="20"/>
         </w:rPr>
-        <w:t xml:space="preserve">{%p for bullet in item.bullets %}</w:t>
+        <w:t xml:space="preserve">{% for bullet in item.bullets %}</w:t>
       </w:r>
     </w:p>
     <w:p>
@@ -351,7 +351,7 @@
           <w:sz w:val="20"/>
           <w:szCs w:val="20"/>
         </w:rPr>
-        <w:t xml:space="preserve">{%p endfor %}</w:t>
+        <w:t xml:space="preserve">{% endfor %}</w:t>
       </w:r>
     </w:p>
     <w:p>
@@ -364,7 +364,7 @@
           <w:sz w:val="20"/>
           <w:szCs w:val="20"/>
         </w:rPr>
-        <w:t xml:space="preserve">{%p endfor %}</w:t>
+        <w:t xml:space="preserve">{% endfor %}</w:t>
       </w:r>
     </w:p>
     <w:p>
@@ -376,8 +376,9 @@
           <w:rFonts w:ascii="Calibri" w:hAnsi="Calibri" w:cs="Calibri"/>
           <w:sz w:val="20"/>
           <w:szCs w:val="20"/>
+          <w:color w:val="1A1A1A"/>
         </w:rPr>
-        <w:t xml:space="preserve">{%p if education %}</w:t>
+        <w:t xml:space="preserve">{% if education %}</w:t>
       </w:r>
     </w:p>
     <w:p>
@@ -409,7 +410,7 @@
           <w:sz w:val="20"/>
           <w:szCs w:val="20"/>
         </w:rPr>
-        <w:t xml:space="preserve">{%p for item in education %}</w:t>
+        <w:t xml:space="preserve">{% for item in education %}</w:t>
       </w:r>
     </w:p>
     <w:p>
@@ -478,28 +479,16 @@
     </w:p>
     <w:p>
       <w:pPr>
-        <w:spacing w:before="0" w:after="30" w:line="240" w:lineRule="auto"/>
-      </w:pPr>
-      <w:r>
-        <w:rPr>
-          <w:rFonts w:ascii="Calibri" w:hAnsi="Calibri" w:cs="Calibri"/>
-          <w:sz w:val="20"/>
-          <w:szCs w:val="20"/>
-        </w:rPr>
-        <w:t xml:space="preserve">{% if item.gpa | default('') %}GPA: {{ item.gpa | default('') }}{% endif %}{% if item.honors | default('') %}  ·  {{ item.honors | default('') }}{% endif %}</w:t>
-      </w:r>
-    </w:p>
-    <w:p>
-      <w:pPr>
         <w:spacing w:before="0" w:after="60" w:line="240" w:lineRule="auto"/>
       </w:pPr>
       <w:r>
         <w:rPr>
           <w:rFonts w:ascii="Calibri" w:hAnsi="Calibri" w:cs="Calibri"/>
-          <w:sz w:val="20"/>
-          <w:szCs w:val="20"/>
+          <w:sz w:val="19"/>
+          <w:szCs w:val="19"/>
+          <w:color w:val="909090"/>
         </w:rPr>
-        <w:t xml:space="preserve">{%p endfor %}</w:t>
+        <w:t xml:space="preserve">{{ ('GPA: ' + item.gpa) if item.gpa else '' }}{{ ('  ·  ' + item.honors) if item.honors else '' }}</w:t>
       </w:r>
     </w:p>
     <w:p>
@@ -512,7 +501,7 @@
           <w:sz w:val="20"/>
           <w:szCs w:val="20"/>
         </w:rPr>
-        <w:t xml:space="preserve">{%p endif %}</w:t>
+        <w:t xml:space="preserve">{% endfor %}</w:t>
       </w:r>
     </w:p>
     <w:p>
@@ -524,8 +513,23 @@
           <w:rFonts w:ascii="Calibri" w:hAnsi="Calibri" w:cs="Calibri"/>
           <w:sz w:val="20"/>
           <w:szCs w:val="20"/>
+          <w:color w:val="1A1A1A"/>
         </w:rPr>
-        <w:t xml:space="preserve">{%p if projects %}</w:t>
+        <w:t xml:space="preserve">{% endif %}</w:t>
+      </w:r>
+    </w:p>
+    <w:p>
+      <w:pPr>
+        <w:spacing w:before="0" w:after="0" w:line="240" w:lineRule="auto"/>
+      </w:pPr>
+      <w:r>
+        <w:rPr>
+          <w:rFonts w:ascii="Calibri" w:hAnsi="Calibri" w:cs="Calibri"/>
+          <w:sz w:val="20"/>
+          <w:szCs w:val="20"/>
+          <w:color w:val="1A1A1A"/>
+        </w:rPr>
+        <w:t xml:space="preserve">{% if projects %}</w:t>
       </w:r>
     </w:p>
     <w:p>
@@ -557,7 +561,7 @@
           <w:sz w:val="20"/>
           <w:szCs w:val="20"/>
         </w:rPr>
-        <w:t xml:space="preserve">{%p for item in projects %}</w:t>
+        <w:t xml:space="preserve">{% for item in projects %}</w:t>
       </w:r>
     </w:p>
     <w:p>
@@ -590,7 +594,7 @@
           <w:sz w:val="19"/>
           <w:szCs w:val="19"/>
         </w:rPr>
-        <w:t xml:space="preserve">{% if item.date_obtained | default('') %}{{ item.date_obtained | default('') }}{% endif %}</w:t>
+        <w:t xml:space="preserve">{{ item.date_obtained if item.date_obtained else '' }}</w:t>
       </w:r>
     </w:p>
     <w:p>
@@ -600,29 +604,13 @@
       <w:r>
         <w:rPr>
           <w:rFonts w:ascii="Calibri" w:hAnsi="Calibri" w:cs="Calibri"/>
-          <w:sz w:val="20"/>
-          <w:szCs w:val="20"/>
-        </w:rPr>
-        <w:t xml:space="preserve">{%p if item.technologies | default('') %}</w:t>
-      </w:r>
-      <w:r>
-        <w:rPr>
-          <w:rFonts w:ascii="Calibri" w:hAnsi="Calibri" w:cs="Calibri"/>
           <w:i/>
           <w:iCs/>
           <w:color w:val="888888"/>
           <w:sz w:val="19"/>
           <w:szCs w:val="19"/>
         </w:rPr>
-        <w:t xml:space="preserve">{{ item.technologies | default('') }}</w:t>
-      </w:r>
-      <w:r>
-        <w:rPr>
-          <w:rFonts w:ascii="Calibri" w:hAnsi="Calibri" w:cs="Calibri"/>
-          <w:sz w:val="20"/>
-          <w:szCs w:val="20"/>
-        </w:rPr>
-        <w:t xml:space="preserve">{%p endif %}</w:t>
+        <w:t xml:space="preserve">{{ ', '.join(item.technologies) if item.technologies else '' }}</w:t>
       </w:r>
     </w:p>
     <w:p>
@@ -635,7 +623,7 @@
           <w:sz w:val="20"/>
           <w:szCs w:val="20"/>
         </w:rPr>
-        <w:t xml:space="preserve">{%p for bullet in item.bullets %}</w:t>
+        <w:t xml:space="preserve">{% for bullet in item.bullets %}</w:t>
       </w:r>
     </w:p>
     <w:p>
@@ -672,7 +660,7 @@
           <w:sz w:val="20"/>
           <w:szCs w:val="20"/>
         </w:rPr>
-        <w:t xml:space="preserve">{%p endfor %}</w:t>
+        <w:t xml:space="preserve">{% endfor %}</w:t>
       </w:r>
     </w:p>
     <w:p>
@@ -685,7 +673,7 @@
           <w:sz w:val="20"/>
           <w:szCs w:val="20"/>
         </w:rPr>
-        <w:t xml:space="preserve">{%p endfor %}</w:t>
+        <w:t xml:space="preserve">{% endfor %}</w:t>
       </w:r>
     </w:p>
     <w:p>
@@ -697,8 +685,9 @@
           <w:rFonts w:ascii="Calibri" w:hAnsi="Calibri" w:cs="Calibri"/>
           <w:sz w:val="20"/>
           <w:szCs w:val="20"/>
+          <w:color w:val="1A1A1A"/>
         </w:rPr>
-        <w:t xml:space="preserve">{%p endif %}</w:t>
+        <w:t xml:space="preserve">{% endif %}</w:t>
       </w:r>
     </w:p>
     <w:p>
@@ -710,8 +699,9 @@
           <w:rFonts w:ascii="Calibri" w:hAnsi="Calibri" w:cs="Calibri"/>
           <w:sz w:val="20"/>
           <w:szCs w:val="20"/>
+          <w:color w:val="1A1A1A"/>
         </w:rPr>
-        <w:t xml:space="preserve">{%p if certifications %}</w:t>
+        <w:t xml:space="preserve">{% if certifications %}</w:t>
       </w:r>
     </w:p>
     <w:p>
@@ -743,7 +733,7 @@
           <w:sz w:val="20"/>
           <w:szCs w:val="20"/>
         </w:rPr>
-        <w:t xml:space="preserve">{%p for item in certifications %}</w:t>
+        <w:t xml:space="preserve">{% for item in certifications %}</w:t>
       </w:r>
     </w:p>
     <w:p>
@@ -776,7 +766,7 @@
           <w:sz w:val="19"/>
           <w:szCs w:val="19"/>
         </w:rPr>
-        <w:t xml:space="preserve">{% if item.date_obtained | default('') %}{{ item.date_obtained | default('') }}{% endif %}</w:t>
+        <w:t xml:space="preserve">{{ item.date_obtained if item.date_obtained else '' }}</w:t>
       </w:r>
     </w:p>
     <w:p>
@@ -792,7 +782,7 @@
           <w:sz w:val="19"/>
           <w:szCs w:val="19"/>
         </w:rPr>
-        <w:t xml:space="preserve">{% if item.issuer %}{{ item.issuer }}{% endif %}</w:t>
+        <w:t xml:space="preserve">{{ item.issuer if item.issuer else '' }}</w:t>
       </w:r>
     </w:p>
     <w:p>
@@ -805,7 +795,7 @@
           <w:sz w:val="20"/>
           <w:szCs w:val="20"/>
         </w:rPr>
-        <w:t xml:space="preserve">{%p endfor %}</w:t>
+        <w:t xml:space="preserve">{% endfor %}</w:t>
       </w:r>
     </w:p>
     <w:p>
@@ -817,8 +807,9 @@
           <w:rFonts w:ascii="Calibri" w:hAnsi="Calibri" w:cs="Calibri"/>
           <w:sz w:val="20"/>
           <w:szCs w:val="20"/>
+          <w:color w:val="1A1A1A"/>
         </w:rPr>
-        <w:t xml:space="preserve">{%p endif %}</w:t>
+        <w:t xml:space="preserve">{% endif %}</w:t>
       </w:r>
     </w:p>
     <w:sectPr>

</xml_diff>

<commit_message>
Enhance resume functionality with file naming and history improvements
</commit_message>
<xml_diff>
--- a/server/app/static/templates/executive.docx
+++ b/server/app/static/templates/executive.docx
@@ -5,7 +5,7 @@
     <w:p>
       <w:pPr>
         <w:pStyle w:val="Title"/>
-        <w:spacing w:before="0" w:after="60" w:line="240" w:lineRule="auto"/>
+        <w:spacing w:before="0" w:after="0" w:line="240" w:lineRule="auto"/>
       </w:pPr>
       <w:r>
         <w:rPr>
@@ -69,7 +69,7 @@
     </w:p>
     <w:p>
       <w:pPr>
-        <w:spacing w:before="50" w:after="50" w:line="240" w:lineRule="auto"/>
+        <w:spacing w:before="0" w:after="0" w:line="240" w:lineRule="auto"/>
       </w:pPr>
       <w:r>
         <w:rPr>
@@ -356,7 +356,7 @@
     </w:p>
     <w:p>
       <w:pPr>
-        <w:spacing w:before="0" w:after="60" w:line="240" w:lineRule="auto"/>
+        <w:spacing w:before="0" w:after="0" w:line="240" w:lineRule="auto"/>
       </w:pPr>
       <w:r>
         <w:rPr>
@@ -463,7 +463,7 @@
     </w:p>
     <w:p>
       <w:pPr>
-        <w:spacing w:before="0" w:after="4" w:line="240" w:lineRule="auto"/>
+        <w:spacing w:before="0" w:after="0" w:line="240" w:lineRule="auto"/>
       </w:pPr>
       <w:r>
         <w:rPr>
@@ -479,7 +479,7 @@
     </w:p>
     <w:p>
       <w:pPr>
-        <w:spacing w:before="0" w:after="60" w:line="240" w:lineRule="auto"/>
+        <w:spacing w:before="0" w:after="0" w:line="240" w:lineRule="auto"/>
       </w:pPr>
       <w:r>
         <w:rPr>
@@ -599,7 +599,7 @@
     </w:p>
     <w:p>
       <w:pPr>
-        <w:spacing w:before="0" w:after="30" w:line="240" w:lineRule="auto"/>
+        <w:spacing w:before="0" w:after="0" w:line="240" w:lineRule="auto"/>
       </w:pPr>
       <w:r>
         <w:rPr>
@@ -665,7 +665,7 @@
     </w:p>
     <w:p>
       <w:pPr>
-        <w:spacing w:before="0" w:after="60" w:line="240" w:lineRule="auto"/>
+        <w:spacing w:before="0" w:after="0" w:line="240" w:lineRule="auto"/>
       </w:pPr>
       <w:r>
         <w:rPr>
@@ -771,7 +771,7 @@
     </w:p>
     <w:p>
       <w:pPr>
-        <w:spacing w:before="0" w:after="40" w:line="240" w:lineRule="auto"/>
+        <w:spacing w:before="0" w:after="0" w:line="240" w:lineRule="auto"/>
       </w:pPr>
       <w:r>
         <w:rPr>

</xml_diff>

<commit_message>
feat: add expiration date support for certifications and update related UI components
</commit_message>
<xml_diff>
--- a/server/app/static/templates/executive.docx
+++ b/server/app/static/templates/executive.docx
@@ -594,7 +594,7 @@
           <w:sz w:val="19"/>
           <w:szCs w:val="19"/>
         </w:rPr>
-        <w:t xml:space="preserve">{{ item.date_obtained if item.date_obtained else '' }}</w:t>
+        <w:t xml:space="preserve">{{ item.date_text if item.date_text else '' }}</w:t>
       </w:r>
     </w:p>
     <w:p>
@@ -766,7 +766,7 @@
           <w:sz w:val="19"/>
           <w:szCs w:val="19"/>
         </w:rPr>
-        <w:t xml:space="preserve">{{ item.date_obtained if item.date_obtained else '' }}</w:t>
+        <w:t xml:space="preserve">{{ item.date_text if item.date_text else '' }}</w:t>
       </w:r>
     </w:p>
     <w:p>

</xml_diff>

<commit_message>
feat: Add comparisonResume state and related functionality to WorkspaceContext and associated components
</commit_message>
<xml_diff>
--- a/server/app/static/templates/executive.docx
+++ b/server/app/static/templates/executive.docx
@@ -109,7 +109,7 @@
           <w:sz w:val="20"/>
           <w:szCs w:val="20"/>
         </w:rPr>
-        <w:t xml:space="preserve">{% for cat in skills %}</w:t>
+        <w:t xml:space="preserve">{%p for cat in skills %}</w:t>
       </w:r>
     </w:p>
     <w:p>
@@ -146,7 +146,7 @@
           <w:sz w:val="20"/>
           <w:szCs w:val="20"/>
         </w:rPr>
-        <w:t xml:space="preserve">{% endfor %}</w:t>
+        <w:t xml:space="preserve">{%p endfor %}</w:t>
       </w:r>
     </w:p>
     <w:p>
@@ -178,7 +178,7 @@
           <w:sz w:val="20"/>
           <w:szCs w:val="20"/>
         </w:rPr>
-        <w:t xml:space="preserve">{% for item in experience %}</w:t>
+        <w:t xml:space="preserve">{%p for item in experience %}</w:t>
       </w:r>
     </w:p>
     <w:p>
@@ -314,7 +314,7 @@
           <w:sz w:val="20"/>
           <w:szCs w:val="20"/>
         </w:rPr>
-        <w:t xml:space="preserve">{% for bullet in item.bullets %}</w:t>
+        <w:t xml:space="preserve">{%p for bullet in item.bullets %}</w:t>
       </w:r>
     </w:p>
     <w:p>
@@ -351,7 +351,7 @@
           <w:sz w:val="20"/>
           <w:szCs w:val="20"/>
         </w:rPr>
-        <w:t xml:space="preserve">{% endfor %}</w:t>
+        <w:t xml:space="preserve">{%p endfor %}</w:t>
       </w:r>
     </w:p>
     <w:p>
@@ -364,7 +364,7 @@
           <w:sz w:val="20"/>
           <w:szCs w:val="20"/>
         </w:rPr>
-        <w:t xml:space="preserve">{% endfor %}</w:t>
+        <w:t xml:space="preserve">{%p endfor %}</w:t>
       </w:r>
     </w:p>
     <w:p>
@@ -378,7 +378,7 @@
           <w:szCs w:val="20"/>
           <w:color w:val="1A1A1A"/>
         </w:rPr>
-        <w:t xml:space="preserve">{% if education %}</w:t>
+        <w:t xml:space="preserve">{%p if education %}</w:t>
       </w:r>
     </w:p>
     <w:p>
@@ -410,7 +410,7 @@
           <w:sz w:val="20"/>
           <w:szCs w:val="20"/>
         </w:rPr>
-        <w:t xml:space="preserve">{% for item in education %}</w:t>
+        <w:t xml:space="preserve">{%p for item in education %}</w:t>
       </w:r>
     </w:p>
     <w:p>
@@ -501,7 +501,7 @@
           <w:sz w:val="20"/>
           <w:szCs w:val="20"/>
         </w:rPr>
-        <w:t xml:space="preserve">{% endfor %}</w:t>
+        <w:t xml:space="preserve">{%p endfor %}</w:t>
       </w:r>
     </w:p>
     <w:p>
@@ -515,7 +515,7 @@
           <w:szCs w:val="20"/>
           <w:color w:val="1A1A1A"/>
         </w:rPr>
-        <w:t xml:space="preserve">{% endif %}</w:t>
+        <w:t xml:space="preserve">{%p endif %}</w:t>
       </w:r>
     </w:p>
     <w:p>
@@ -529,7 +529,7 @@
           <w:szCs w:val="20"/>
           <w:color w:val="1A1A1A"/>
         </w:rPr>
-        <w:t xml:space="preserve">{% if projects %}</w:t>
+        <w:t xml:space="preserve">{%p if projects %}</w:t>
       </w:r>
     </w:p>
     <w:p>
@@ -561,7 +561,7 @@
           <w:sz w:val="20"/>
           <w:szCs w:val="20"/>
         </w:rPr>
-        <w:t xml:space="preserve">{% for item in projects %}</w:t>
+        <w:t xml:space="preserve">{%p for item in projects %}</w:t>
       </w:r>
     </w:p>
     <w:p>
@@ -623,7 +623,7 @@
           <w:sz w:val="20"/>
           <w:szCs w:val="20"/>
         </w:rPr>
-        <w:t xml:space="preserve">{% for bullet in item.bullets %}</w:t>
+        <w:t xml:space="preserve">{%p for bullet in item.bullets %}</w:t>
       </w:r>
     </w:p>
     <w:p>
@@ -660,7 +660,7 @@
           <w:sz w:val="20"/>
           <w:szCs w:val="20"/>
         </w:rPr>
-        <w:t xml:space="preserve">{% endfor %}</w:t>
+        <w:t xml:space="preserve">{%p endfor %}</w:t>
       </w:r>
     </w:p>
     <w:p>
@@ -673,7 +673,7 @@
           <w:sz w:val="20"/>
           <w:szCs w:val="20"/>
         </w:rPr>
-        <w:t xml:space="preserve">{% endfor %}</w:t>
+        <w:t xml:space="preserve">{%p endfor %}</w:t>
       </w:r>
     </w:p>
     <w:p>
@@ -687,7 +687,7 @@
           <w:szCs w:val="20"/>
           <w:color w:val="1A1A1A"/>
         </w:rPr>
-        <w:t xml:space="preserve">{% endif %}</w:t>
+        <w:t xml:space="preserve">{%p endif %}</w:t>
       </w:r>
     </w:p>
     <w:p>
@@ -701,7 +701,7 @@
           <w:szCs w:val="20"/>
           <w:color w:val="1A1A1A"/>
         </w:rPr>
-        <w:t xml:space="preserve">{% if certifications %}</w:t>
+        <w:t xml:space="preserve">{%p if certifications %}</w:t>
       </w:r>
     </w:p>
     <w:p>
@@ -733,7 +733,7 @@
           <w:sz w:val="20"/>
           <w:szCs w:val="20"/>
         </w:rPr>
-        <w:t xml:space="preserve">{% for item in certifications %}</w:t>
+        <w:t xml:space="preserve">{%p for item in certifications %}</w:t>
       </w:r>
     </w:p>
     <w:p>
@@ -795,7 +795,7 @@
           <w:sz w:val="20"/>
           <w:szCs w:val="20"/>
         </w:rPr>
-        <w:t xml:space="preserve">{% endfor %}</w:t>
+        <w:t xml:space="preserve">{%p endfor %}</w:t>
       </w:r>
     </w:p>
     <w:p>
@@ -809,7 +809,7 @@
           <w:szCs w:val="20"/>
           <w:color w:val="1A1A1A"/>
         </w:rPr>
-        <w:t xml:space="preserve">{% endif %}</w:t>
+        <w:t xml:space="preserve">{%p endif %}</w:t>
       </w:r>
     </w:p>
     <w:sectPr>

</xml_diff>

<commit_message>
style: Update CSS styles for profile resume list and rows; adjust padding and margins refactor: Remove unused AI model from ConfigStep and routes
</commit_message>
<xml_diff>
--- a/server/app/static/templates/executive.docx
+++ b/server/app/static/templates/executive.docx
@@ -5,6 +5,7 @@
     <w:p>
       <w:pPr>
         <w:pStyle w:val="Title"/>
+        <w:jc w:val="center"/>
         <w:spacing w:before="0" w:after="0" w:line="240" w:lineRule="auto"/>
       </w:pPr>
       <w:r>
@@ -250,7 +251,7 @@
     </w:p>
     <w:p>
       <w:pPr>
-        <w:spacing w:before="0" w:after="40" w:line="240" w:lineRule="auto"/>
+        <w:spacing w:before="0" w:after="0" w:line="240" w:lineRule="auto"/>
       </w:pPr>
       <w:r>
         <w:rPr>
@@ -274,7 +275,7 @@
     </w:p>
     <w:p>
       <w:pPr>
-        <w:spacing w:before="0" w:after="30" w:line="240" w:lineRule="auto"/>
+        <w:spacing w:before="0" w:after="0" w:line="240" w:lineRule="auto"/>
       </w:pPr>
       <w:r>
         <w:rPr>

</xml_diff>

<commit_message>
feat: Implement function to remove trailing empty paragraphs in document rendering
</commit_message>
<xml_diff>
--- a/server/app/static/templates/executive.docx
+++ b/server/app/static/templates/executive.docx
@@ -278,31 +278,23 @@
         <w:spacing w:before="0" w:after="0" w:line="240" w:lineRule="auto"/>
       </w:pPr>
       <w:r>
-        <w:rPr>
-          <w:rFonts w:ascii="Calibri" w:hAnsi="Calibri" w:cs="Calibri"/>
-          <w:sz w:val="20"/>
-          <w:szCs w:val="20"/>
-        </w:rPr>
-        <w:t xml:space="preserve">{% if item.context %}</w:t>
+        <w:t>{%p if item.context %}</w:t>
       </w:r>
+    </w:p>
+    <w:p>
+      <w:pPr>
+        <w:spacing w:before="0" w:after="0" w:line="240" w:lineRule="auto"/>
+      </w:pPr>
       <w:r>
-        <w:rPr>
-          <w:rFonts w:ascii="Calibri" w:hAnsi="Calibri" w:cs="Calibri"/>
-          <w:i/>
-          <w:iCs/>
-          <w:color w:val="888888"/>
-          <w:sz w:val="19"/>
-          <w:szCs w:val="19"/>
-        </w:rPr>
-        <w:t xml:space="preserve"/>
+        <w:t>{{ item.context }}</w:t>
       </w:r>
+    </w:p>
+    <w:p>
+      <w:pPr>
+        <w:spacing w:before="0" w:after="0" w:line="240" w:lineRule="auto"/>
+      </w:pPr>
       <w:r>
-        <w:rPr>
-          <w:rFonts w:ascii="Calibri" w:hAnsi="Calibri" w:cs="Calibri"/>
-          <w:sz w:val="20"/>
-          <w:szCs w:val="20"/>
-        </w:rPr>
-        <w:t xml:space="preserve">{{ item.context | default('') }}{% endif %}</w:t>
+        <w:t>{%p endif %}</w:t>
       </w:r>
     </w:p>
     <w:p>

</xml_diff>

<commit_message>
chore: Update document files for improved formatting and consistency
</commit_message>
<xml_diff>
--- a/server/app/static/templates/executive.docx
+++ b/server/app/static/templates/executive.docx
@@ -286,6 +286,12 @@
         <w:spacing w:before="0" w:after="0" w:line="240" w:lineRule="auto"/>
       </w:pPr>
       <w:r>
+        <w:rPr>
+          <w:i/>
+          <w:color w:val="666666"/>
+          <w:sz w:val="19"/>
+          <w:szCs w:val="19"/>
+        </w:rPr>
         <w:t>{{ item.context }}</w:t>
       </w:r>
     </w:p>

</xml_diff>

<commit_message>
feat: Add normalization script for resume templates to improve formatting and consistency
</commit_message>
<xml_diff>
--- a/server/app/static/templates/executive.docx
+++ b/server/app/static/templates/executive.docx
@@ -20,7 +20,7 @@
     <w:p>
       <w:pPr>
         <w:jc w:val="center"/>
-        <w:spacing w:before="0" w:after="20" w:line="240" w:lineRule="auto"/>
+        <w:spacing w:before="240" w:after="0" w:line="240" w:lineRule="auto"/>
       </w:pPr>
       <w:r>
         <w:rPr>
@@ -51,7 +51,7 @@
     </w:p>
     <w:p>
       <w:pPr>
-        <w:spacing w:before="160" w:after="40" w:line="240" w:lineRule="auto"/>
+        <w:spacing w:before="240" w:after="0" w:line="240" w:lineRule="auto"/>
         <w:pBdr>
           <w:bottom w:val="single" w:sz="4" w:space="3" w:color="000000"/>
         </w:pBdr>
@@ -83,7 +83,7 @@
     </w:p>
     <w:p>
       <w:pPr>
-        <w:spacing w:before="160" w:after="40" w:line="240" w:lineRule="auto"/>
+        <w:spacing w:before="240" w:after="0" w:line="240" w:lineRule="auto"/>
         <w:pBdr>
           <w:bottom w:val="single" w:sz="4" w:space="3" w:color="000000"/>
         </w:pBdr>
@@ -115,7 +115,7 @@
     </w:p>
     <w:p>
       <w:pPr>
-        <w:spacing w:before="40" w:after="30" w:line="240" w:lineRule="auto"/>
+        <w:spacing w:before="0" w:after="0" w:line="240" w:lineRule="auto"/>
       </w:pPr>
       <w:r>
         <w:rPr>
@@ -152,7 +152,7 @@
     </w:p>
     <w:p>
       <w:pPr>
-        <w:spacing w:before="160" w:after="40" w:line="240" w:lineRule="auto"/>
+        <w:spacing w:before="240" w:after="0" w:line="240" w:lineRule="auto"/>
         <w:pBdr>
           <w:bottom w:val="single" w:sz="4" w:space="3" w:color="000000"/>
         </w:pBdr>
@@ -184,7 +184,7 @@
     </w:p>
     <w:p>
       <w:pPr>
-        <w:spacing w:before="120" w:after="0" w:line="240" w:lineRule="auto"/>
+        <w:spacing w:before="240" w:after="0" w:line="240" w:lineRule="auto"/>
         <w:tabs>
           <w:tab w:val="right" w:pos="9360"/>
         </w:tabs>
@@ -204,7 +204,7 @@
           <w:sz w:val="19"/>
           <w:szCs w:val="19"/>
         </w:rPr>
-        <w:t xml:space="preserve">,  </w:t>
+        <w:t>{{ '   ·   ' if item.location else '' }}</w:t>
       </w:r>
       <w:r>
         <w:rPr>
@@ -223,7 +223,7 @@
           <w:sz w:val="20"/>
           <w:szCs w:val="20"/>
         </w:rPr>
-        <w:t xml:space="preserve">{{ item.location | default('') }}</w:t>
+        <w:t>{{ item.location }}</w:t>
       </w:r>
       <w:r>
         <w:rPr>
@@ -318,7 +318,7 @@
     </w:p>
     <w:p>
       <w:pPr>
-        <w:spacing w:before="30" w:after="30" w:line="240" w:lineRule="auto"/>
+        <w:spacing w:before="240" w:after="0" w:line="240" w:lineRule="auto"/>
         <w:contextualSpacing/>
         <w:ind w:left="360" w:hanging="240"/>
       </w:pPr>
@@ -382,7 +382,7 @@
     </w:p>
     <w:p>
       <w:pPr>
-        <w:spacing w:before="160" w:after="40" w:line="240" w:lineRule="auto"/>
+        <w:spacing w:before="240" w:after="0" w:line="240" w:lineRule="auto"/>
         <w:pBdr>
           <w:bottom w:val="single" w:sz="4" w:space="3" w:color="000000"/>
         </w:pBdr>
@@ -414,7 +414,7 @@
     </w:p>
     <w:p>
       <w:pPr>
-        <w:spacing w:before="120" w:after="0" w:line="240" w:lineRule="auto"/>
+        <w:spacing w:before="240" w:after="0" w:line="240" w:lineRule="auto"/>
         <w:tabs>
           <w:tab w:val="right" w:pos="9360"/>
         </w:tabs>
@@ -434,7 +434,7 @@
           <w:sz w:val="19"/>
           <w:szCs w:val="19"/>
         </w:rPr>
-        <w:t xml:space="preserve">,  </w:t>
+        <w:t>{{ '   ·   ' if item.location else '' }}</w:t>
       </w:r>
       <w:r>
         <w:rPr>
@@ -442,7 +442,7 @@
           <w:sz w:val="20"/>
           <w:szCs w:val="20"/>
         </w:rPr>
-        <w:t xml:space="preserve">{{ item.location | default('') }}</w:t>
+        <w:t>{{ item.location }}</w:t>
       </w:r>
       <w:r>
         <w:rPr>
@@ -533,7 +533,7 @@
     </w:p>
     <w:p>
       <w:pPr>
-        <w:spacing w:before="160" w:after="40" w:line="240" w:lineRule="auto"/>
+        <w:spacing w:before="240" w:after="0" w:line="240" w:lineRule="auto"/>
         <w:pBdr>
           <w:bottom w:val="single" w:sz="4" w:space="3" w:color="000000"/>
         </w:pBdr>
@@ -565,7 +565,7 @@
     </w:p>
     <w:p>
       <w:pPr>
-        <w:spacing w:before="120" w:after="0" w:line="240" w:lineRule="auto"/>
+        <w:spacing w:before="240" w:after="0" w:line="240" w:lineRule="auto"/>
         <w:tabs>
           <w:tab w:val="right" w:pos="9360"/>
         </w:tabs>
@@ -627,7 +627,7 @@
     </w:p>
     <w:p>
       <w:pPr>
-        <w:spacing w:before="30" w:after="30" w:line="240" w:lineRule="auto"/>
+        <w:spacing w:before="240" w:after="0" w:line="240" w:lineRule="auto"/>
         <w:contextualSpacing/>
         <w:ind w:left="360" w:hanging="240"/>
       </w:pPr>
@@ -705,7 +705,7 @@
     </w:p>
     <w:p>
       <w:pPr>
-        <w:spacing w:before="160" w:after="40" w:line="240" w:lineRule="auto"/>
+        <w:spacing w:before="240" w:after="0" w:line="240" w:lineRule="auto"/>
         <w:pBdr>
           <w:bottom w:val="single" w:sz="4" w:space="3" w:color="000000"/>
         </w:pBdr>
@@ -737,7 +737,7 @@
     </w:p>
     <w:p>
       <w:pPr>
-        <w:spacing w:before="60" w:after="0" w:line="240" w:lineRule="auto"/>
+        <w:spacing w:before="240" w:after="0" w:line="240" w:lineRule="auto"/>
         <w:tabs>
           <w:tab w:val="right" w:pos="9360"/>
         </w:tabs>

</xml_diff>